<commit_message>
docs(web): record public release
Mark the isolated Akademate web release complete and preserve the verified live evidence in the strategy checklist.
</commit_message>
<xml_diff>
--- a/docs/strategy/Akademate_Strategy_Reservations_Verticals_Domains_Payments.docx
+++ b/docs/strategy/Akademate_Strategy_Reservations_Verticals_Domains_Payments.docx
@@ -1675,7 +1675,47 @@
         <w:pStyle w:val="ListBullet"/>
       </w:pPr>
       <w:r>
-        <w:t>☐ Fase 8: commit/push y despliegue independiente de `apps/web` con verificación de artefacto servido.</w:t>
+        <w:t>☑ Fase 8: commit/push y despliegue independiente de `apps/web` con verificación de artefacto servido.</w:t>
+      </w:r>
+    </w:p>
+    <w:p>
+      <w:pPr>
+        <w:pStyle w:val="Heading1"/>
+      </w:pPr>
+      <w:r>
+        <w:t>Evidencia de release</w:t>
+      </w:r>
+    </w:p>
+    <w:p>
+      <w:pPr>
+        <w:pStyle w:val="ListBullet"/>
+      </w:pPr>
+      <w:r>
+        <w:t>Release público inicial: `fd595da03e62af33d488b3f6dbb51a56e163d663`.</w:t>
+      </w:r>
+    </w:p>
+    <w:p>
+      <w:pPr>
+        <w:pStyle w:val="ListBullet"/>
+      </w:pPr>
+      <w:r>
+        <w:t>Servicio modificado: únicamente `akademate-web`.</w:t>
+      </w:r>
+    </w:p>
+    <w:p>
+      <w:pPr>
+        <w:pStyle w:val="ListBullet"/>
+      </w:pPr>
+      <w:r>
+        <w:t>Verificación live: health con revisión exacta, contenido nuevo servido y 9/9 E2E aprobados.</w:t>
+      </w:r>
+    </w:p>
+    <w:p>
+      <w:pPr>
+        <w:pStyle w:val="ListBullet"/>
+      </w:pPr>
+      <w:r>
+        <w:t>Invariantes: IDs de los tres contenedores tenant sin cambios; ningún despliegue CEP.</w:t>
       </w:r>
     </w:p>
     <w:p>

</xml_diff>